<commit_message>
research: 27 new docs (196 sages with research), map filter chips + card click, hover keeps filter
</commit_message>
<xml_diff>
--- a/data/רבי ישראל איסרלן.docx
+++ b/data/רבי ישראל איסרלן.docx
@@ -94,9 +94,1764 @@
           <w:color w:val="303030"/>
           <w:sz w:val="21"/>
           <w:szCs w:val="21"/>
-          <w:rtl w:val="0"/>
-        </w:rPr>
-        <w:t xml:space="preserve">Этот текст посвящен жизни и наследию раввина Исраэля Иссерлейна, выдающегося духовного лидера XV века, который восстановил галахический мир ашкеназского еврейства после периодов разрушительных гонений. Центральное место в его трудах занимает книга «Трумат ха-Дешен», структура которой глубоко символична и включает 354 вопроса, соответствующих количеству дней в лунном году. Автор подчеркивает уникальный метод Иссерлейна: использование «теоретических вопросов» для создания всеобъемлющего учебного кодекса, а также его стремление закрепить авторитет местных обычаев как юридическую основу. В конечном итоге источник раскрывает историческую значимость Иссерлейна как «столпа» веры, чьи постановления стали фундаментом для примечаний Рамо к Шулхан Аруху, определив облик современного ашкеназского права.</w:t>
+          <w:rtl w:val="1"/>
+        </w:rPr>
+        <w:t xml:space="preserve">סקירה</w:t>
+      </w:r>
+      <w:r>
+        <w:rPr>
+          <w:color w:val="303030"/>
+          <w:sz w:val="21"/>
+          <w:szCs w:val="21"/>
+          <w:rtl w:val="1"/>
+        </w:rPr>
+        <w:t xml:space="preserve"> </w:t>
+      </w:r>
+      <w:r>
+        <w:rPr>
+          <w:color w:val="303030"/>
+          <w:sz w:val="21"/>
+          <w:szCs w:val="21"/>
+          <w:rtl w:val="1"/>
+        </w:rPr>
+        <w:t xml:space="preserve">זו</w:t>
+      </w:r>
+      <w:r>
+        <w:rPr>
+          <w:color w:val="303030"/>
+          <w:sz w:val="21"/>
+          <w:szCs w:val="21"/>
+          <w:rtl w:val="1"/>
+        </w:rPr>
+        <w:t xml:space="preserve"> </w:t>
+      </w:r>
+      <w:r>
+        <w:rPr>
+          <w:color w:val="303030"/>
+          <w:sz w:val="21"/>
+          <w:szCs w:val="21"/>
+          <w:rtl w:val="1"/>
+        </w:rPr>
+        <w:t xml:space="preserve">בוחנת</w:t>
+      </w:r>
+      <w:r>
+        <w:rPr>
+          <w:color w:val="303030"/>
+          <w:sz w:val="21"/>
+          <w:szCs w:val="21"/>
+          <w:rtl w:val="1"/>
+        </w:rPr>
+        <w:t xml:space="preserve"> </w:t>
+      </w:r>
+      <w:r>
+        <w:rPr>
+          <w:color w:val="303030"/>
+          <w:sz w:val="21"/>
+          <w:szCs w:val="21"/>
+          <w:rtl w:val="1"/>
+        </w:rPr>
+        <w:t xml:space="preserve">את</w:t>
+      </w:r>
+      <w:r>
+        <w:rPr>
+          <w:color w:val="303030"/>
+          <w:sz w:val="21"/>
+          <w:szCs w:val="21"/>
+          <w:rtl w:val="1"/>
+        </w:rPr>
+        <w:t xml:space="preserve"> </w:t>
+      </w:r>
+      <w:r>
+        <w:rPr>
+          <w:color w:val="303030"/>
+          <w:sz w:val="21"/>
+          <w:szCs w:val="21"/>
+          <w:rtl w:val="1"/>
+        </w:rPr>
+        <w:t xml:space="preserve">דמותו</w:t>
+      </w:r>
+      <w:r>
+        <w:rPr>
+          <w:color w:val="303030"/>
+          <w:sz w:val="21"/>
+          <w:szCs w:val="21"/>
+          <w:rtl w:val="1"/>
+        </w:rPr>
+        <w:t xml:space="preserve"> </w:t>
+      </w:r>
+      <w:r>
+        <w:rPr>
+          <w:color w:val="303030"/>
+          <w:sz w:val="21"/>
+          <w:szCs w:val="21"/>
+          <w:rtl w:val="1"/>
+        </w:rPr>
+        <w:t xml:space="preserve">והשפעתו</w:t>
+      </w:r>
+      <w:r>
+        <w:rPr>
+          <w:color w:val="303030"/>
+          <w:sz w:val="21"/>
+          <w:szCs w:val="21"/>
+          <w:rtl w:val="1"/>
+        </w:rPr>
+        <w:t xml:space="preserve"> </w:t>
+      </w:r>
+      <w:r>
+        <w:rPr>
+          <w:color w:val="303030"/>
+          <w:sz w:val="21"/>
+          <w:szCs w:val="21"/>
+          <w:rtl w:val="1"/>
+        </w:rPr>
+        <w:t xml:space="preserve">של</w:t>
+      </w:r>
+      <w:r>
+        <w:rPr>
+          <w:color w:val="303030"/>
+          <w:sz w:val="21"/>
+          <w:szCs w:val="21"/>
+          <w:rtl w:val="1"/>
+        </w:rPr>
+        <w:t xml:space="preserve"> </w:t>
+      </w:r>
+      <w:r>
+        <w:rPr>
+          <w:color w:val="303030"/>
+          <w:sz w:val="21"/>
+          <w:szCs w:val="21"/>
+          <w:rtl w:val="1"/>
+        </w:rPr>
+        <w:t xml:space="preserve">רבי</w:t>
+      </w:r>
+      <w:r>
+        <w:rPr>
+          <w:color w:val="303030"/>
+          <w:sz w:val="21"/>
+          <w:szCs w:val="21"/>
+          <w:rtl w:val="1"/>
+        </w:rPr>
+        <w:t xml:space="preserve"> </w:t>
+      </w:r>
+      <w:r>
+        <w:rPr>
+          <w:color w:val="303030"/>
+          <w:sz w:val="21"/>
+          <w:szCs w:val="21"/>
+          <w:rtl w:val="1"/>
+        </w:rPr>
+        <w:t xml:space="preserve">ישראל</w:t>
+      </w:r>
+      <w:r>
+        <w:rPr>
+          <w:color w:val="303030"/>
+          <w:sz w:val="21"/>
+          <w:szCs w:val="21"/>
+          <w:rtl w:val="1"/>
+        </w:rPr>
+        <w:t xml:space="preserve"> </w:t>
+      </w:r>
+      <w:r>
+        <w:rPr>
+          <w:color w:val="303030"/>
+          <w:sz w:val="21"/>
+          <w:szCs w:val="21"/>
+          <w:rtl w:val="1"/>
+        </w:rPr>
+        <w:t xml:space="preserve">איסרלן</w:t>
+      </w:r>
+      <w:r>
+        <w:rPr>
+          <w:color w:val="303030"/>
+          <w:sz w:val="21"/>
+          <w:szCs w:val="21"/>
+          <w:rtl w:val="1"/>
+        </w:rPr>
+        <w:t xml:space="preserve">, </w:t>
+      </w:r>
+      <w:r>
+        <w:rPr>
+          <w:color w:val="303030"/>
+          <w:sz w:val="21"/>
+          <w:szCs w:val="21"/>
+          <w:rtl w:val="1"/>
+        </w:rPr>
+        <w:t xml:space="preserve">המהרא</w:t>
+      </w:r>
+      <w:r>
+        <w:rPr>
+          <w:color w:val="303030"/>
+          <w:sz w:val="21"/>
+          <w:szCs w:val="21"/>
+          <w:rtl w:val="1"/>
+        </w:rPr>
+        <w:t xml:space="preserve">"</w:t>
+      </w:r>
+      <w:r>
+        <w:rPr>
+          <w:color w:val="303030"/>
+          <w:sz w:val="21"/>
+          <w:szCs w:val="21"/>
+          <w:rtl w:val="1"/>
+        </w:rPr>
+        <w:t xml:space="preserve">י</w:t>
+      </w:r>
+      <w:r>
+        <w:rPr>
+          <w:color w:val="303030"/>
+          <w:sz w:val="21"/>
+          <w:szCs w:val="21"/>
+          <w:rtl w:val="1"/>
+        </w:rPr>
+        <w:t xml:space="preserve">, </w:t>
+      </w:r>
+      <w:r>
+        <w:rPr>
+          <w:color w:val="303030"/>
+          <w:sz w:val="21"/>
+          <w:szCs w:val="21"/>
+          <w:rtl w:val="1"/>
+        </w:rPr>
+        <w:t xml:space="preserve">שפעל</w:t>
+      </w:r>
+      <w:r>
+        <w:rPr>
+          <w:color w:val="303030"/>
+          <w:sz w:val="21"/>
+          <w:szCs w:val="21"/>
+          <w:rtl w:val="1"/>
+        </w:rPr>
+        <w:t xml:space="preserve"> </w:t>
+      </w:r>
+      <w:r>
+        <w:rPr>
+          <w:color w:val="303030"/>
+          <w:sz w:val="21"/>
+          <w:szCs w:val="21"/>
+          <w:rtl w:val="1"/>
+        </w:rPr>
+        <w:t xml:space="preserve">במאה</w:t>
+      </w:r>
+      <w:r>
+        <w:rPr>
+          <w:color w:val="303030"/>
+          <w:sz w:val="21"/>
+          <w:szCs w:val="21"/>
+          <w:rtl w:val="1"/>
+        </w:rPr>
+        <w:t xml:space="preserve"> </w:t>
+      </w:r>
+      <w:r>
+        <w:rPr>
+          <w:color w:val="303030"/>
+          <w:sz w:val="21"/>
+          <w:szCs w:val="21"/>
+          <w:rtl w:val="1"/>
+        </w:rPr>
+        <w:t xml:space="preserve">ה</w:t>
+      </w:r>
+      <w:r>
+        <w:rPr>
+          <w:color w:val="303030"/>
+          <w:sz w:val="21"/>
+          <w:szCs w:val="21"/>
+          <w:rtl w:val="1"/>
+        </w:rPr>
+        <w:t xml:space="preserve">-15 </w:t>
+      </w:r>
+      <w:r>
+        <w:rPr>
+          <w:color w:val="303030"/>
+          <w:sz w:val="21"/>
+          <w:szCs w:val="21"/>
+          <w:rtl w:val="1"/>
+        </w:rPr>
+        <w:t xml:space="preserve">והיה</w:t>
+      </w:r>
+      <w:r>
+        <w:rPr>
+          <w:color w:val="303030"/>
+          <w:sz w:val="21"/>
+          <w:szCs w:val="21"/>
+          <w:rtl w:val="1"/>
+        </w:rPr>
+        <w:t xml:space="preserve"> </w:t>
+      </w:r>
+      <w:r>
+        <w:rPr>
+          <w:color w:val="303030"/>
+          <w:sz w:val="21"/>
+          <w:szCs w:val="21"/>
+          <w:rtl w:val="1"/>
+        </w:rPr>
+        <w:t xml:space="preserve">לאחד</w:t>
+      </w:r>
+      <w:r>
+        <w:rPr>
+          <w:color w:val="303030"/>
+          <w:sz w:val="21"/>
+          <w:szCs w:val="21"/>
+          <w:rtl w:val="1"/>
+        </w:rPr>
+        <w:t xml:space="preserve"> </w:t>
+      </w:r>
+      <w:r>
+        <w:rPr>
+          <w:color w:val="303030"/>
+          <w:sz w:val="21"/>
+          <w:szCs w:val="21"/>
+          <w:rtl w:val="1"/>
+        </w:rPr>
+        <w:t xml:space="preserve">מגדולי</w:t>
+      </w:r>
+      <w:r>
+        <w:rPr>
+          <w:color w:val="303030"/>
+          <w:sz w:val="21"/>
+          <w:szCs w:val="21"/>
+          <w:rtl w:val="1"/>
+        </w:rPr>
+        <w:t xml:space="preserve"> </w:t>
+      </w:r>
+      <w:r>
+        <w:rPr>
+          <w:color w:val="303030"/>
+          <w:sz w:val="21"/>
+          <w:szCs w:val="21"/>
+          <w:rtl w:val="1"/>
+        </w:rPr>
+        <w:t xml:space="preserve">מעצבי</w:t>
+      </w:r>
+      <w:r>
+        <w:rPr>
+          <w:color w:val="303030"/>
+          <w:sz w:val="21"/>
+          <w:szCs w:val="21"/>
+          <w:rtl w:val="1"/>
+        </w:rPr>
+        <w:t xml:space="preserve"> </w:t>
+      </w:r>
+      <w:r>
+        <w:rPr>
+          <w:color w:val="303030"/>
+          <w:sz w:val="21"/>
+          <w:szCs w:val="21"/>
+          <w:rtl w:val="1"/>
+        </w:rPr>
+        <w:t xml:space="preserve">ההלכה</w:t>
+      </w:r>
+      <w:r>
+        <w:rPr>
+          <w:color w:val="303030"/>
+          <w:sz w:val="21"/>
+          <w:szCs w:val="21"/>
+          <w:rtl w:val="1"/>
+        </w:rPr>
+        <w:t xml:space="preserve"> </w:t>
+      </w:r>
+      <w:r>
+        <w:rPr>
+          <w:color w:val="303030"/>
+          <w:sz w:val="21"/>
+          <w:szCs w:val="21"/>
+          <w:rtl w:val="1"/>
+        </w:rPr>
+        <w:t xml:space="preserve">והמנהג</w:t>
+      </w:r>
+      <w:r>
+        <w:rPr>
+          <w:color w:val="303030"/>
+          <w:sz w:val="21"/>
+          <w:szCs w:val="21"/>
+          <w:rtl w:val="1"/>
+        </w:rPr>
+        <w:t xml:space="preserve"> </w:t>
+      </w:r>
+      <w:r>
+        <w:rPr>
+          <w:color w:val="303030"/>
+          <w:sz w:val="21"/>
+          <w:szCs w:val="21"/>
+          <w:rtl w:val="1"/>
+        </w:rPr>
+        <w:t xml:space="preserve">האשכנזי</w:t>
+      </w:r>
+      <w:r>
+        <w:rPr>
+          <w:color w:val="303030"/>
+          <w:sz w:val="21"/>
+          <w:szCs w:val="21"/>
+          <w:rtl w:val="1"/>
+        </w:rPr>
+        <w:t xml:space="preserve">. </w:t>
+      </w:r>
+      <w:r>
+        <w:rPr>
+          <w:color w:val="303030"/>
+          <w:sz w:val="21"/>
+          <w:szCs w:val="21"/>
+          <w:rtl w:val="1"/>
+        </w:rPr>
+        <w:t xml:space="preserve">הטקסט</w:t>
+      </w:r>
+      <w:r>
+        <w:rPr>
+          <w:color w:val="303030"/>
+          <w:sz w:val="21"/>
+          <w:szCs w:val="21"/>
+          <w:rtl w:val="1"/>
+        </w:rPr>
+        <w:t xml:space="preserve"> </w:t>
+      </w:r>
+      <w:r>
+        <w:rPr>
+          <w:color w:val="303030"/>
+          <w:sz w:val="21"/>
+          <w:szCs w:val="21"/>
+          <w:rtl w:val="1"/>
+        </w:rPr>
+        <w:t xml:space="preserve">מציג</w:t>
+      </w:r>
+      <w:r>
+        <w:rPr>
+          <w:color w:val="303030"/>
+          <w:sz w:val="21"/>
+          <w:szCs w:val="21"/>
+          <w:rtl w:val="1"/>
+        </w:rPr>
+        <w:t xml:space="preserve"> </w:t>
+      </w:r>
+      <w:r>
+        <w:rPr>
+          <w:color w:val="303030"/>
+          <w:sz w:val="21"/>
+          <w:szCs w:val="21"/>
+          <w:rtl w:val="1"/>
+        </w:rPr>
+        <w:t xml:space="preserve">את</w:t>
+      </w:r>
+      <w:r>
+        <w:rPr>
+          <w:color w:val="303030"/>
+          <w:sz w:val="21"/>
+          <w:szCs w:val="21"/>
+          <w:rtl w:val="1"/>
+        </w:rPr>
+        <w:t xml:space="preserve"> </w:t>
+      </w:r>
+      <w:r>
+        <w:rPr>
+          <w:color w:val="303030"/>
+          <w:sz w:val="21"/>
+          <w:szCs w:val="21"/>
+          <w:rtl w:val="1"/>
+        </w:rPr>
+        <w:t xml:space="preserve">חיבורו</w:t>
+      </w:r>
+      <w:r>
+        <w:rPr>
+          <w:color w:val="303030"/>
+          <w:sz w:val="21"/>
+          <w:szCs w:val="21"/>
+          <w:rtl w:val="1"/>
+        </w:rPr>
+        <w:t xml:space="preserve"> </w:t>
+      </w:r>
+      <w:r>
+        <w:rPr>
+          <w:color w:val="303030"/>
+          <w:sz w:val="21"/>
+          <w:szCs w:val="21"/>
+          <w:rtl w:val="1"/>
+        </w:rPr>
+        <w:t xml:space="preserve">המרכזי</w:t>
+      </w:r>
+      <w:r>
+        <w:rPr>
+          <w:color w:val="303030"/>
+          <w:sz w:val="21"/>
+          <w:szCs w:val="21"/>
+          <w:rtl w:val="1"/>
+        </w:rPr>
+        <w:t xml:space="preserve">, "</w:t>
+      </w:r>
+      <w:r>
+        <w:rPr>
+          <w:color w:val="303030"/>
+          <w:sz w:val="21"/>
+          <w:szCs w:val="21"/>
+          <w:rtl w:val="1"/>
+        </w:rPr>
+        <w:t xml:space="preserve">תרומת</w:t>
+      </w:r>
+      <w:r>
+        <w:rPr>
+          <w:color w:val="303030"/>
+          <w:sz w:val="21"/>
+          <w:szCs w:val="21"/>
+          <w:rtl w:val="1"/>
+        </w:rPr>
+        <w:t xml:space="preserve"> </w:t>
+      </w:r>
+      <w:r>
+        <w:rPr>
+          <w:color w:val="303030"/>
+          <w:sz w:val="21"/>
+          <w:szCs w:val="21"/>
+          <w:rtl w:val="1"/>
+        </w:rPr>
+        <w:t xml:space="preserve">הדשן</w:t>
+      </w:r>
+      <w:r>
+        <w:rPr>
+          <w:color w:val="303030"/>
+          <w:sz w:val="21"/>
+          <w:szCs w:val="21"/>
+          <w:rtl w:val="1"/>
+        </w:rPr>
+        <w:t xml:space="preserve">", </w:t>
+      </w:r>
+      <w:r>
+        <w:rPr>
+          <w:color w:val="303030"/>
+          <w:sz w:val="21"/>
+          <w:szCs w:val="21"/>
+          <w:rtl w:val="1"/>
+        </w:rPr>
+        <w:t xml:space="preserve">כקודקס</w:t>
+      </w:r>
+      <w:r>
+        <w:rPr>
+          <w:color w:val="303030"/>
+          <w:sz w:val="21"/>
+          <w:szCs w:val="21"/>
+          <w:rtl w:val="1"/>
+        </w:rPr>
+        <w:t xml:space="preserve"> </w:t>
+      </w:r>
+      <w:r>
+        <w:rPr>
+          <w:color w:val="303030"/>
+          <w:sz w:val="21"/>
+          <w:szCs w:val="21"/>
+          <w:rtl w:val="1"/>
+        </w:rPr>
+        <w:t xml:space="preserve">הלכתי</w:t>
+      </w:r>
+      <w:r>
+        <w:rPr>
+          <w:color w:val="303030"/>
+          <w:sz w:val="21"/>
+          <w:szCs w:val="21"/>
+          <w:rtl w:val="1"/>
+        </w:rPr>
+        <w:t xml:space="preserve"> </w:t>
+      </w:r>
+      <w:r>
+        <w:rPr>
+          <w:color w:val="303030"/>
+          <w:sz w:val="21"/>
+          <w:szCs w:val="21"/>
+          <w:rtl w:val="1"/>
+        </w:rPr>
+        <w:t xml:space="preserve">המאורגן</w:t>
+      </w:r>
+      <w:r>
+        <w:rPr>
+          <w:color w:val="303030"/>
+          <w:sz w:val="21"/>
+          <w:szCs w:val="21"/>
+          <w:rtl w:val="1"/>
+        </w:rPr>
+        <w:t xml:space="preserve"> </w:t>
+      </w:r>
+      <w:r>
+        <w:rPr>
+          <w:color w:val="303030"/>
+          <w:sz w:val="21"/>
+          <w:szCs w:val="21"/>
+          <w:rtl w:val="1"/>
+        </w:rPr>
+        <w:t xml:space="preserve">במבנה</w:t>
+      </w:r>
+      <w:r>
+        <w:rPr>
+          <w:color w:val="303030"/>
+          <w:sz w:val="21"/>
+          <w:szCs w:val="21"/>
+          <w:rtl w:val="1"/>
+        </w:rPr>
+        <w:t xml:space="preserve"> </w:t>
+      </w:r>
+      <w:r>
+        <w:rPr>
+          <w:color w:val="303030"/>
+          <w:sz w:val="21"/>
+          <w:szCs w:val="21"/>
+          <w:rtl w:val="1"/>
+        </w:rPr>
+        <w:t xml:space="preserve">סמלי</w:t>
+      </w:r>
+      <w:r>
+        <w:rPr>
+          <w:color w:val="303030"/>
+          <w:sz w:val="21"/>
+          <w:szCs w:val="21"/>
+          <w:rtl w:val="1"/>
+        </w:rPr>
+        <w:t xml:space="preserve"> </w:t>
+      </w:r>
+      <w:r>
+        <w:rPr>
+          <w:color w:val="303030"/>
+          <w:sz w:val="21"/>
+          <w:szCs w:val="21"/>
+          <w:rtl w:val="1"/>
+        </w:rPr>
+        <w:t xml:space="preserve">של</w:t>
+      </w:r>
+      <w:r>
+        <w:rPr>
+          <w:color w:val="303030"/>
+          <w:sz w:val="21"/>
+          <w:szCs w:val="21"/>
+          <w:rtl w:val="1"/>
+        </w:rPr>
+        <w:t xml:space="preserve"> 354 </w:t>
+      </w:r>
+      <w:r>
+        <w:rPr>
+          <w:color w:val="303030"/>
+          <w:sz w:val="21"/>
+          <w:szCs w:val="21"/>
+          <w:rtl w:val="1"/>
+        </w:rPr>
+        <w:t xml:space="preserve">סימנים</w:t>
+      </w:r>
+      <w:r>
+        <w:rPr>
+          <w:color w:val="303030"/>
+          <w:sz w:val="21"/>
+          <w:szCs w:val="21"/>
+          <w:rtl w:val="1"/>
+        </w:rPr>
+        <w:t xml:space="preserve">, </w:t>
+      </w:r>
+      <w:r>
+        <w:rPr>
+          <w:color w:val="303030"/>
+          <w:sz w:val="21"/>
+          <w:szCs w:val="21"/>
+          <w:rtl w:val="1"/>
+        </w:rPr>
+        <w:t xml:space="preserve">ומדגיש</w:t>
+      </w:r>
+      <w:r>
+        <w:rPr>
+          <w:color w:val="303030"/>
+          <w:sz w:val="21"/>
+          <w:szCs w:val="21"/>
+          <w:rtl w:val="1"/>
+        </w:rPr>
+        <w:t xml:space="preserve"> </w:t>
+      </w:r>
+      <w:r>
+        <w:rPr>
+          <w:color w:val="303030"/>
+          <w:sz w:val="21"/>
+          <w:szCs w:val="21"/>
+          <w:rtl w:val="1"/>
+        </w:rPr>
+        <w:t xml:space="preserve">את</w:t>
+      </w:r>
+      <w:r>
+        <w:rPr>
+          <w:color w:val="303030"/>
+          <w:sz w:val="21"/>
+          <w:szCs w:val="21"/>
+          <w:rtl w:val="1"/>
+        </w:rPr>
+        <w:t xml:space="preserve"> </w:t>
+      </w:r>
+      <w:r>
+        <w:rPr>
+          <w:color w:val="303030"/>
+          <w:sz w:val="21"/>
+          <w:szCs w:val="21"/>
+          <w:rtl w:val="1"/>
+        </w:rPr>
+        <w:t xml:space="preserve">שיטת</w:t>
+      </w:r>
+      <w:r>
+        <w:rPr>
+          <w:color w:val="303030"/>
+          <w:sz w:val="21"/>
+          <w:szCs w:val="21"/>
+          <w:rtl w:val="1"/>
+        </w:rPr>
+        <w:t xml:space="preserve"> </w:t>
+      </w:r>
+      <w:r>
+        <w:rPr>
+          <w:color w:val="303030"/>
+          <w:sz w:val="21"/>
+          <w:szCs w:val="21"/>
+          <w:rtl w:val="1"/>
+        </w:rPr>
+        <w:t xml:space="preserve">הכתיבה</w:t>
+      </w:r>
+      <w:r>
+        <w:rPr>
+          <w:color w:val="303030"/>
+          <w:sz w:val="21"/>
+          <w:szCs w:val="21"/>
+          <w:rtl w:val="1"/>
+        </w:rPr>
+        <w:t xml:space="preserve"> </w:t>
+      </w:r>
+      <w:r>
+        <w:rPr>
+          <w:color w:val="303030"/>
+          <w:sz w:val="21"/>
+          <w:szCs w:val="21"/>
+          <w:rtl w:val="1"/>
+        </w:rPr>
+        <w:t xml:space="preserve">הייחודית</w:t>
+      </w:r>
+      <w:r>
+        <w:rPr>
+          <w:color w:val="303030"/>
+          <w:sz w:val="21"/>
+          <w:szCs w:val="21"/>
+          <w:rtl w:val="1"/>
+        </w:rPr>
+        <w:t xml:space="preserve"> </w:t>
+      </w:r>
+      <w:r>
+        <w:rPr>
+          <w:color w:val="303030"/>
+          <w:sz w:val="21"/>
+          <w:szCs w:val="21"/>
+          <w:rtl w:val="1"/>
+        </w:rPr>
+        <w:t xml:space="preserve">שלו</w:t>
+      </w:r>
+      <w:r>
+        <w:rPr>
+          <w:color w:val="303030"/>
+          <w:sz w:val="21"/>
+          <w:szCs w:val="21"/>
+          <w:rtl w:val="1"/>
+        </w:rPr>
+        <w:t xml:space="preserve"> </w:t>
+      </w:r>
+      <w:r>
+        <w:rPr>
+          <w:color w:val="303030"/>
+          <w:sz w:val="21"/>
+          <w:szCs w:val="21"/>
+          <w:rtl w:val="1"/>
+        </w:rPr>
+        <w:t xml:space="preserve">שכללה</w:t>
+      </w:r>
+      <w:r>
+        <w:rPr>
+          <w:color w:val="303030"/>
+          <w:sz w:val="21"/>
+          <w:szCs w:val="21"/>
+          <w:rtl w:val="1"/>
+        </w:rPr>
+        <w:t xml:space="preserve"> </w:t>
+      </w:r>
+      <w:r>
+        <w:rPr>
+          <w:color w:val="303030"/>
+          <w:sz w:val="21"/>
+          <w:szCs w:val="21"/>
+          <w:rtl w:val="1"/>
+        </w:rPr>
+        <w:t xml:space="preserve">לעיתים</w:t>
+      </w:r>
+      <w:r>
+        <w:rPr>
+          <w:color w:val="303030"/>
+          <w:sz w:val="21"/>
+          <w:szCs w:val="21"/>
+          <w:rtl w:val="1"/>
+        </w:rPr>
+        <w:t xml:space="preserve"> </w:t>
+      </w:r>
+      <w:r>
+        <w:rPr>
+          <w:color w:val="303030"/>
+          <w:sz w:val="21"/>
+          <w:szCs w:val="21"/>
+          <w:rtl w:val="1"/>
+        </w:rPr>
+        <w:t xml:space="preserve">שאלות</w:t>
+      </w:r>
+      <w:r>
+        <w:rPr>
+          <w:color w:val="303030"/>
+          <w:sz w:val="21"/>
+          <w:szCs w:val="21"/>
+          <w:rtl w:val="1"/>
+        </w:rPr>
+        <w:t xml:space="preserve"> </w:t>
+      </w:r>
+      <w:r>
+        <w:rPr>
+          <w:color w:val="303030"/>
+          <w:sz w:val="21"/>
+          <w:szCs w:val="21"/>
+          <w:rtl w:val="1"/>
+        </w:rPr>
+        <w:t xml:space="preserve">תיאורטיות</w:t>
+      </w:r>
+      <w:r>
+        <w:rPr>
+          <w:color w:val="303030"/>
+          <w:sz w:val="21"/>
+          <w:szCs w:val="21"/>
+          <w:rtl w:val="1"/>
+        </w:rPr>
+        <w:t xml:space="preserve"> </w:t>
+      </w:r>
+      <w:r>
+        <w:rPr>
+          <w:color w:val="303030"/>
+          <w:sz w:val="21"/>
+          <w:szCs w:val="21"/>
+          <w:rtl w:val="1"/>
+        </w:rPr>
+        <w:t xml:space="preserve">לצורך</w:t>
+      </w:r>
+      <w:r>
+        <w:rPr>
+          <w:color w:val="303030"/>
+          <w:sz w:val="21"/>
+          <w:szCs w:val="21"/>
+          <w:rtl w:val="1"/>
+        </w:rPr>
+        <w:t xml:space="preserve"> </w:t>
+      </w:r>
+      <w:r>
+        <w:rPr>
+          <w:color w:val="303030"/>
+          <w:sz w:val="21"/>
+          <w:szCs w:val="21"/>
+          <w:rtl w:val="1"/>
+        </w:rPr>
+        <w:t xml:space="preserve">בירור</w:t>
+      </w:r>
+      <w:r>
+        <w:rPr>
+          <w:color w:val="303030"/>
+          <w:sz w:val="21"/>
+          <w:szCs w:val="21"/>
+          <w:rtl w:val="1"/>
+        </w:rPr>
+        <w:t xml:space="preserve"> </w:t>
+      </w:r>
+      <w:r>
+        <w:rPr>
+          <w:color w:val="303030"/>
+          <w:sz w:val="21"/>
+          <w:szCs w:val="21"/>
+          <w:rtl w:val="1"/>
+        </w:rPr>
+        <w:t xml:space="preserve">הלכתי</w:t>
+      </w:r>
+      <w:r>
+        <w:rPr>
+          <w:color w:val="303030"/>
+          <w:sz w:val="21"/>
+          <w:szCs w:val="21"/>
+          <w:rtl w:val="1"/>
+        </w:rPr>
+        <w:t xml:space="preserve"> </w:t>
+      </w:r>
+      <w:r>
+        <w:rPr>
+          <w:color w:val="303030"/>
+          <w:sz w:val="21"/>
+          <w:szCs w:val="21"/>
+          <w:rtl w:val="1"/>
+        </w:rPr>
+        <w:t xml:space="preserve">מקיף</w:t>
+      </w:r>
+      <w:r>
+        <w:rPr>
+          <w:color w:val="303030"/>
+          <w:sz w:val="21"/>
+          <w:szCs w:val="21"/>
+          <w:rtl w:val="1"/>
+        </w:rPr>
+        <w:t xml:space="preserve">. </w:t>
+      </w:r>
+      <w:r>
+        <w:rPr>
+          <w:color w:val="303030"/>
+          <w:sz w:val="21"/>
+          <w:szCs w:val="21"/>
+          <w:rtl w:val="1"/>
+        </w:rPr>
+        <w:t xml:space="preserve">מעבר</w:t>
+      </w:r>
+      <w:r>
+        <w:rPr>
+          <w:color w:val="303030"/>
+          <w:sz w:val="21"/>
+          <w:szCs w:val="21"/>
+          <w:rtl w:val="1"/>
+        </w:rPr>
+        <w:t xml:space="preserve"> </w:t>
+      </w:r>
+      <w:r>
+        <w:rPr>
+          <w:color w:val="303030"/>
+          <w:sz w:val="21"/>
+          <w:szCs w:val="21"/>
+          <w:rtl w:val="1"/>
+        </w:rPr>
+        <w:t xml:space="preserve">לפסיקה</w:t>
+      </w:r>
+      <w:r>
+        <w:rPr>
+          <w:color w:val="303030"/>
+          <w:sz w:val="21"/>
+          <w:szCs w:val="21"/>
+          <w:rtl w:val="1"/>
+        </w:rPr>
+        <w:t xml:space="preserve"> </w:t>
+      </w:r>
+      <w:r>
+        <w:rPr>
+          <w:color w:val="303030"/>
+          <w:sz w:val="21"/>
+          <w:szCs w:val="21"/>
+          <w:rtl w:val="1"/>
+        </w:rPr>
+        <w:t xml:space="preserve">היבשה</w:t>
+      </w:r>
+      <w:r>
+        <w:rPr>
+          <w:color w:val="303030"/>
+          <w:sz w:val="21"/>
+          <w:szCs w:val="21"/>
+          <w:rtl w:val="1"/>
+        </w:rPr>
+        <w:t xml:space="preserve">, </w:t>
+      </w:r>
+      <w:r>
+        <w:rPr>
+          <w:color w:val="303030"/>
+          <w:sz w:val="21"/>
+          <w:szCs w:val="21"/>
+          <w:rtl w:val="1"/>
+        </w:rPr>
+        <w:t xml:space="preserve">המקור</w:t>
+      </w:r>
+      <w:r>
+        <w:rPr>
+          <w:color w:val="303030"/>
+          <w:sz w:val="21"/>
+          <w:szCs w:val="21"/>
+          <w:rtl w:val="1"/>
+        </w:rPr>
+        <w:t xml:space="preserve"> </w:t>
+      </w:r>
+      <w:r>
+        <w:rPr>
+          <w:color w:val="303030"/>
+          <w:sz w:val="21"/>
+          <w:szCs w:val="21"/>
+          <w:rtl w:val="1"/>
+        </w:rPr>
+        <w:t xml:space="preserve">שופך</w:t>
+      </w:r>
+      <w:r>
+        <w:rPr>
+          <w:color w:val="303030"/>
+          <w:sz w:val="21"/>
+          <w:szCs w:val="21"/>
+          <w:rtl w:val="1"/>
+        </w:rPr>
+        <w:t xml:space="preserve"> </w:t>
+      </w:r>
+      <w:r>
+        <w:rPr>
+          <w:color w:val="303030"/>
+          <w:sz w:val="21"/>
+          <w:szCs w:val="21"/>
+          <w:rtl w:val="1"/>
+        </w:rPr>
+        <w:t xml:space="preserve">אור</w:t>
+      </w:r>
+      <w:r>
+        <w:rPr>
+          <w:color w:val="303030"/>
+          <w:sz w:val="21"/>
+          <w:szCs w:val="21"/>
+          <w:rtl w:val="1"/>
+        </w:rPr>
+        <w:t xml:space="preserve"> </w:t>
+      </w:r>
+      <w:r>
+        <w:rPr>
+          <w:color w:val="303030"/>
+          <w:sz w:val="21"/>
+          <w:szCs w:val="21"/>
+          <w:rtl w:val="1"/>
+        </w:rPr>
+        <w:t xml:space="preserve">על</w:t>
+      </w:r>
+      <w:r>
+        <w:rPr>
+          <w:color w:val="303030"/>
+          <w:sz w:val="21"/>
+          <w:szCs w:val="21"/>
+          <w:rtl w:val="1"/>
+        </w:rPr>
+        <w:t xml:space="preserve"> </w:t>
+      </w:r>
+      <w:r>
+        <w:rPr>
+          <w:color w:val="303030"/>
+          <w:sz w:val="21"/>
+          <w:szCs w:val="21"/>
+          <w:rtl w:val="1"/>
+        </w:rPr>
+        <w:t xml:space="preserve">המנהג</w:t>
+      </w:r>
+      <w:r>
+        <w:rPr>
+          <w:color w:val="303030"/>
+          <w:sz w:val="21"/>
+          <w:szCs w:val="21"/>
+          <w:rtl w:val="1"/>
+        </w:rPr>
+        <w:t xml:space="preserve"> </w:t>
+      </w:r>
+      <w:r>
+        <w:rPr>
+          <w:color w:val="303030"/>
+          <w:sz w:val="21"/>
+          <w:szCs w:val="21"/>
+          <w:rtl w:val="1"/>
+        </w:rPr>
+        <w:t xml:space="preserve">ככלי</w:t>
+      </w:r>
+      <w:r>
+        <w:rPr>
+          <w:color w:val="303030"/>
+          <w:sz w:val="21"/>
+          <w:szCs w:val="21"/>
+          <w:rtl w:val="1"/>
+        </w:rPr>
+        <w:t xml:space="preserve"> </w:t>
+      </w:r>
+      <w:r>
+        <w:rPr>
+          <w:color w:val="303030"/>
+          <w:sz w:val="21"/>
+          <w:szCs w:val="21"/>
+          <w:rtl w:val="1"/>
+        </w:rPr>
+        <w:t xml:space="preserve">משפטי</w:t>
+      </w:r>
+      <w:r>
+        <w:rPr>
+          <w:color w:val="303030"/>
+          <w:sz w:val="21"/>
+          <w:szCs w:val="21"/>
+          <w:rtl w:val="1"/>
+        </w:rPr>
+        <w:t xml:space="preserve"> </w:t>
+      </w:r>
+      <w:r>
+        <w:rPr>
+          <w:color w:val="303030"/>
+          <w:sz w:val="21"/>
+          <w:szCs w:val="21"/>
+          <w:rtl w:val="1"/>
+        </w:rPr>
+        <w:t xml:space="preserve">עליון</w:t>
+      </w:r>
+      <w:r>
+        <w:rPr>
+          <w:color w:val="303030"/>
+          <w:sz w:val="21"/>
+          <w:szCs w:val="21"/>
+          <w:rtl w:val="1"/>
+        </w:rPr>
+        <w:t xml:space="preserve"> </w:t>
+      </w:r>
+      <w:r>
+        <w:rPr>
+          <w:color w:val="303030"/>
+          <w:sz w:val="21"/>
+          <w:szCs w:val="21"/>
+          <w:rtl w:val="1"/>
+        </w:rPr>
+        <w:t xml:space="preserve">ועל</w:t>
+      </w:r>
+      <w:r>
+        <w:rPr>
+          <w:color w:val="303030"/>
+          <w:sz w:val="21"/>
+          <w:szCs w:val="21"/>
+          <w:rtl w:val="1"/>
+        </w:rPr>
+        <w:t xml:space="preserve"> </w:t>
+      </w:r>
+      <w:r>
+        <w:rPr>
+          <w:color w:val="303030"/>
+          <w:sz w:val="21"/>
+          <w:szCs w:val="21"/>
+          <w:rtl w:val="1"/>
+        </w:rPr>
+        <w:t xml:space="preserve">ההמשכיות</w:t>
+      </w:r>
+      <w:r>
+        <w:rPr>
+          <w:color w:val="303030"/>
+          <w:sz w:val="21"/>
+          <w:szCs w:val="21"/>
+          <w:rtl w:val="1"/>
+        </w:rPr>
+        <w:t xml:space="preserve"> </w:t>
+      </w:r>
+      <w:r>
+        <w:rPr>
+          <w:color w:val="303030"/>
+          <w:sz w:val="21"/>
+          <w:szCs w:val="21"/>
+          <w:rtl w:val="1"/>
+        </w:rPr>
+        <w:t xml:space="preserve">הרוחנית</w:t>
+      </w:r>
+      <w:r>
+        <w:rPr>
+          <w:color w:val="303030"/>
+          <w:sz w:val="21"/>
+          <w:szCs w:val="21"/>
+          <w:rtl w:val="1"/>
+        </w:rPr>
+        <w:t xml:space="preserve"> </w:t>
+      </w:r>
+      <w:r>
+        <w:rPr>
+          <w:color w:val="303030"/>
+          <w:sz w:val="21"/>
+          <w:szCs w:val="21"/>
+          <w:rtl w:val="1"/>
+        </w:rPr>
+        <w:t xml:space="preserve">של</w:t>
+      </w:r>
+      <w:r>
+        <w:rPr>
+          <w:color w:val="303030"/>
+          <w:sz w:val="21"/>
+          <w:szCs w:val="21"/>
+          <w:rtl w:val="1"/>
+        </w:rPr>
+        <w:t xml:space="preserve"> </w:t>
+      </w:r>
+      <w:r>
+        <w:rPr>
+          <w:color w:val="303030"/>
+          <w:sz w:val="21"/>
+          <w:szCs w:val="21"/>
+          <w:rtl w:val="1"/>
+        </w:rPr>
+        <w:t xml:space="preserve">יהדות</w:t>
+      </w:r>
+      <w:r>
+        <w:rPr>
+          <w:color w:val="303030"/>
+          <w:sz w:val="21"/>
+          <w:szCs w:val="21"/>
+          <w:rtl w:val="1"/>
+        </w:rPr>
+        <w:t xml:space="preserve"> </w:t>
+      </w:r>
+      <w:r>
+        <w:rPr>
+          <w:color w:val="303030"/>
+          <w:sz w:val="21"/>
+          <w:szCs w:val="21"/>
+          <w:rtl w:val="1"/>
+        </w:rPr>
+        <w:t xml:space="preserve">אירופה</w:t>
+      </w:r>
+      <w:r>
+        <w:rPr>
+          <w:color w:val="303030"/>
+          <w:sz w:val="21"/>
+          <w:szCs w:val="21"/>
+          <w:rtl w:val="1"/>
+        </w:rPr>
+        <w:t xml:space="preserve"> </w:t>
+      </w:r>
+      <w:r>
+        <w:rPr>
+          <w:color w:val="303030"/>
+          <w:sz w:val="21"/>
+          <w:szCs w:val="21"/>
+          <w:rtl w:val="1"/>
+        </w:rPr>
+        <w:t xml:space="preserve">לאחר</w:t>
+      </w:r>
+      <w:r>
+        <w:rPr>
+          <w:color w:val="303030"/>
+          <w:sz w:val="21"/>
+          <w:szCs w:val="21"/>
+          <w:rtl w:val="1"/>
+        </w:rPr>
+        <w:t xml:space="preserve"> </w:t>
+      </w:r>
+      <w:r>
+        <w:rPr>
+          <w:color w:val="303030"/>
+          <w:sz w:val="21"/>
+          <w:szCs w:val="21"/>
+          <w:rtl w:val="1"/>
+        </w:rPr>
+        <w:t xml:space="preserve">תקופות</w:t>
+      </w:r>
+      <w:r>
+        <w:rPr>
+          <w:color w:val="303030"/>
+          <w:sz w:val="21"/>
+          <w:szCs w:val="21"/>
+          <w:rtl w:val="1"/>
+        </w:rPr>
+        <w:t xml:space="preserve"> </w:t>
+      </w:r>
+      <w:r>
+        <w:rPr>
+          <w:color w:val="303030"/>
+          <w:sz w:val="21"/>
+          <w:szCs w:val="21"/>
+          <w:rtl w:val="1"/>
+        </w:rPr>
+        <w:t xml:space="preserve">של</w:t>
+      </w:r>
+      <w:r>
+        <w:rPr>
+          <w:color w:val="303030"/>
+          <w:sz w:val="21"/>
+          <w:szCs w:val="21"/>
+          <w:rtl w:val="1"/>
+        </w:rPr>
+        <w:t xml:space="preserve"> </w:t>
+      </w:r>
+      <w:r>
+        <w:rPr>
+          <w:color w:val="303030"/>
+          <w:sz w:val="21"/>
+          <w:szCs w:val="21"/>
+          <w:rtl w:val="1"/>
+        </w:rPr>
+        <w:t xml:space="preserve">חורבן</w:t>
+      </w:r>
+      <w:r>
+        <w:rPr>
+          <w:color w:val="303030"/>
+          <w:sz w:val="21"/>
+          <w:szCs w:val="21"/>
+          <w:rtl w:val="1"/>
+        </w:rPr>
+        <w:t xml:space="preserve"> </w:t>
+      </w:r>
+      <w:r>
+        <w:rPr>
+          <w:color w:val="303030"/>
+          <w:sz w:val="21"/>
+          <w:szCs w:val="21"/>
+          <w:rtl w:val="1"/>
+        </w:rPr>
+        <w:t xml:space="preserve">ורדיפות</w:t>
+      </w:r>
+      <w:r>
+        <w:rPr>
+          <w:color w:val="303030"/>
+          <w:sz w:val="21"/>
+          <w:szCs w:val="21"/>
+          <w:rtl w:val="1"/>
+        </w:rPr>
+        <w:t xml:space="preserve">. </w:t>
+      </w:r>
+      <w:r>
+        <w:rPr>
+          <w:color w:val="303030"/>
+          <w:sz w:val="21"/>
+          <w:szCs w:val="21"/>
+          <w:rtl w:val="1"/>
+        </w:rPr>
+        <w:t xml:space="preserve">לבסוף</w:t>
+      </w:r>
+      <w:r>
+        <w:rPr>
+          <w:color w:val="303030"/>
+          <w:sz w:val="21"/>
+          <w:szCs w:val="21"/>
+          <w:rtl w:val="1"/>
+        </w:rPr>
+        <w:t xml:space="preserve">, </w:t>
+      </w:r>
+      <w:r>
+        <w:rPr>
+          <w:color w:val="303030"/>
+          <w:sz w:val="21"/>
+          <w:szCs w:val="21"/>
+          <w:rtl w:val="1"/>
+        </w:rPr>
+        <w:t xml:space="preserve">מוסבר</w:t>
+      </w:r>
+      <w:r>
+        <w:rPr>
+          <w:color w:val="303030"/>
+          <w:sz w:val="21"/>
+          <w:szCs w:val="21"/>
+          <w:rtl w:val="1"/>
+        </w:rPr>
+        <w:t xml:space="preserve"> </w:t>
+      </w:r>
+      <w:r>
+        <w:rPr>
+          <w:color w:val="303030"/>
+          <w:sz w:val="21"/>
+          <w:szCs w:val="21"/>
+          <w:rtl w:val="1"/>
+        </w:rPr>
+        <w:t xml:space="preserve">כיצד</w:t>
+      </w:r>
+      <w:r>
+        <w:rPr>
+          <w:color w:val="303030"/>
+          <w:sz w:val="21"/>
+          <w:szCs w:val="21"/>
+          <w:rtl w:val="1"/>
+        </w:rPr>
+        <w:t xml:space="preserve"> </w:t>
+      </w:r>
+      <w:r>
+        <w:rPr>
+          <w:color w:val="303030"/>
+          <w:sz w:val="21"/>
+          <w:szCs w:val="21"/>
+          <w:rtl w:val="1"/>
+        </w:rPr>
+        <w:t xml:space="preserve">משנתו</w:t>
+      </w:r>
+      <w:r>
+        <w:rPr>
+          <w:color w:val="303030"/>
+          <w:sz w:val="21"/>
+          <w:szCs w:val="21"/>
+          <w:rtl w:val="1"/>
+        </w:rPr>
+        <w:t xml:space="preserve"> </w:t>
+      </w:r>
+      <w:r>
+        <w:rPr>
+          <w:color w:val="303030"/>
+          <w:sz w:val="21"/>
+          <w:szCs w:val="21"/>
+          <w:rtl w:val="1"/>
+        </w:rPr>
+        <w:t xml:space="preserve">של</w:t>
+      </w:r>
+      <w:r>
+        <w:rPr>
+          <w:color w:val="303030"/>
+          <w:sz w:val="21"/>
+          <w:szCs w:val="21"/>
+          <w:rtl w:val="1"/>
+        </w:rPr>
+        <w:t xml:space="preserve"> </w:t>
+      </w:r>
+      <w:r>
+        <w:rPr>
+          <w:color w:val="303030"/>
+          <w:sz w:val="21"/>
+          <w:szCs w:val="21"/>
+          <w:rtl w:val="1"/>
+        </w:rPr>
+        <w:t xml:space="preserve">המהרא</w:t>
+      </w:r>
+      <w:r>
+        <w:rPr>
+          <w:color w:val="303030"/>
+          <w:sz w:val="21"/>
+          <w:szCs w:val="21"/>
+          <w:rtl w:val="1"/>
+        </w:rPr>
+        <w:t xml:space="preserve">"</w:t>
+      </w:r>
+      <w:r>
+        <w:rPr>
+          <w:color w:val="303030"/>
+          <w:sz w:val="21"/>
+          <w:szCs w:val="21"/>
+          <w:rtl w:val="1"/>
+        </w:rPr>
+        <w:t xml:space="preserve">י</w:t>
+      </w:r>
+      <w:r>
+        <w:rPr>
+          <w:color w:val="303030"/>
+          <w:sz w:val="21"/>
+          <w:szCs w:val="21"/>
+          <w:rtl w:val="1"/>
+        </w:rPr>
+        <w:t xml:space="preserve"> </w:t>
+      </w:r>
+      <w:r>
+        <w:rPr>
+          <w:color w:val="303030"/>
+          <w:sz w:val="21"/>
+          <w:szCs w:val="21"/>
+          <w:rtl w:val="1"/>
+        </w:rPr>
+        <w:t xml:space="preserve">הפכה</w:t>
+      </w:r>
+      <w:r>
+        <w:rPr>
+          <w:color w:val="303030"/>
+          <w:sz w:val="21"/>
+          <w:szCs w:val="21"/>
+          <w:rtl w:val="1"/>
+        </w:rPr>
+        <w:t xml:space="preserve"> </w:t>
+      </w:r>
+      <w:r>
+        <w:rPr>
+          <w:color w:val="303030"/>
+          <w:sz w:val="21"/>
+          <w:szCs w:val="21"/>
+          <w:rtl w:val="1"/>
+        </w:rPr>
+        <w:t xml:space="preserve">לתשתית</w:t>
+      </w:r>
+      <w:r>
+        <w:rPr>
+          <w:color w:val="303030"/>
+          <w:sz w:val="21"/>
+          <w:szCs w:val="21"/>
+          <w:rtl w:val="1"/>
+        </w:rPr>
+        <w:t xml:space="preserve"> </w:t>
+      </w:r>
+      <w:r>
+        <w:rPr>
+          <w:color w:val="303030"/>
+          <w:sz w:val="21"/>
+          <w:szCs w:val="21"/>
+          <w:rtl w:val="1"/>
+        </w:rPr>
+        <w:t xml:space="preserve">עבור</w:t>
+      </w:r>
+      <w:r>
+        <w:rPr>
+          <w:color w:val="303030"/>
+          <w:sz w:val="21"/>
+          <w:szCs w:val="21"/>
+          <w:rtl w:val="1"/>
+        </w:rPr>
+        <w:t xml:space="preserve"> </w:t>
+      </w:r>
+      <w:r>
+        <w:rPr>
+          <w:color w:val="303030"/>
+          <w:sz w:val="21"/>
+          <w:szCs w:val="21"/>
+          <w:rtl w:val="1"/>
+        </w:rPr>
+        <w:t xml:space="preserve">הגהות</w:t>
+      </w:r>
+      <w:r>
+        <w:rPr>
+          <w:color w:val="303030"/>
+          <w:sz w:val="21"/>
+          <w:szCs w:val="21"/>
+          <w:rtl w:val="1"/>
+        </w:rPr>
+        <w:t xml:space="preserve"> </w:t>
+      </w:r>
+      <w:r>
+        <w:rPr>
+          <w:color w:val="303030"/>
+          <w:sz w:val="21"/>
+          <w:szCs w:val="21"/>
+          <w:rtl w:val="1"/>
+        </w:rPr>
+        <w:t xml:space="preserve">הרמ</w:t>
+      </w:r>
+      <w:r>
+        <w:rPr>
+          <w:color w:val="303030"/>
+          <w:sz w:val="21"/>
+          <w:szCs w:val="21"/>
+          <w:rtl w:val="1"/>
+        </w:rPr>
+        <w:t xml:space="preserve">"</w:t>
+      </w:r>
+      <w:r>
+        <w:rPr>
+          <w:color w:val="303030"/>
+          <w:sz w:val="21"/>
+          <w:szCs w:val="21"/>
+          <w:rtl w:val="1"/>
+        </w:rPr>
+        <w:t xml:space="preserve">א</w:t>
+      </w:r>
+      <w:r>
+        <w:rPr>
+          <w:color w:val="303030"/>
+          <w:sz w:val="21"/>
+          <w:szCs w:val="21"/>
+          <w:rtl w:val="1"/>
+        </w:rPr>
+        <w:t xml:space="preserve"> </w:t>
+      </w:r>
+      <w:r>
+        <w:rPr>
+          <w:color w:val="303030"/>
+          <w:sz w:val="21"/>
+          <w:szCs w:val="21"/>
+          <w:rtl w:val="1"/>
+        </w:rPr>
+        <w:t xml:space="preserve">על</w:t>
+      </w:r>
+      <w:r>
+        <w:rPr>
+          <w:color w:val="303030"/>
+          <w:sz w:val="21"/>
+          <w:szCs w:val="21"/>
+          <w:rtl w:val="1"/>
+        </w:rPr>
+        <w:t xml:space="preserve"> </w:t>
+      </w:r>
+      <w:r>
+        <w:rPr>
+          <w:color w:val="303030"/>
+          <w:sz w:val="21"/>
+          <w:szCs w:val="21"/>
+          <w:rtl w:val="1"/>
+        </w:rPr>
+        <w:t xml:space="preserve">השולחן</w:t>
+      </w:r>
+      <w:r>
+        <w:rPr>
+          <w:color w:val="303030"/>
+          <w:sz w:val="21"/>
+          <w:szCs w:val="21"/>
+          <w:rtl w:val="1"/>
+        </w:rPr>
+        <w:t xml:space="preserve"> </w:t>
+      </w:r>
+      <w:r>
+        <w:rPr>
+          <w:color w:val="303030"/>
+          <w:sz w:val="21"/>
+          <w:szCs w:val="21"/>
+          <w:rtl w:val="1"/>
+        </w:rPr>
+        <w:t xml:space="preserve">ערוך</w:t>
+      </w:r>
+      <w:r>
+        <w:rPr>
+          <w:color w:val="303030"/>
+          <w:sz w:val="21"/>
+          <w:szCs w:val="21"/>
+          <w:rtl w:val="1"/>
+        </w:rPr>
+        <w:t xml:space="preserve">, </w:t>
+      </w:r>
+      <w:r>
+        <w:rPr>
+          <w:color w:val="303030"/>
+          <w:sz w:val="21"/>
+          <w:szCs w:val="21"/>
+          <w:rtl w:val="1"/>
+        </w:rPr>
+        <w:t xml:space="preserve">ובכך</w:t>
+      </w:r>
+      <w:r>
+        <w:rPr>
+          <w:color w:val="303030"/>
+          <w:sz w:val="21"/>
+          <w:szCs w:val="21"/>
+          <w:rtl w:val="1"/>
+        </w:rPr>
+        <w:t xml:space="preserve"> </w:t>
+      </w:r>
+      <w:r>
+        <w:rPr>
+          <w:color w:val="303030"/>
+          <w:sz w:val="21"/>
+          <w:szCs w:val="21"/>
+          <w:rtl w:val="1"/>
+        </w:rPr>
+        <w:t xml:space="preserve">הבטיחה</w:t>
+      </w:r>
+      <w:r>
+        <w:rPr>
+          <w:color w:val="303030"/>
+          <w:sz w:val="21"/>
+          <w:szCs w:val="21"/>
+          <w:rtl w:val="1"/>
+        </w:rPr>
+        <w:t xml:space="preserve"> </w:t>
+      </w:r>
+      <w:r>
+        <w:rPr>
+          <w:color w:val="303030"/>
+          <w:sz w:val="21"/>
+          <w:szCs w:val="21"/>
+          <w:rtl w:val="1"/>
+        </w:rPr>
+        <w:t xml:space="preserve">את</w:t>
+      </w:r>
+      <w:r>
+        <w:rPr>
+          <w:color w:val="303030"/>
+          <w:sz w:val="21"/>
+          <w:szCs w:val="21"/>
+          <w:rtl w:val="1"/>
+        </w:rPr>
+        <w:t xml:space="preserve"> </w:t>
+      </w:r>
+      <w:r>
+        <w:rPr>
+          <w:color w:val="303030"/>
+          <w:sz w:val="21"/>
+          <w:szCs w:val="21"/>
+          <w:rtl w:val="1"/>
+        </w:rPr>
+        <w:t xml:space="preserve">מרכזיותו</w:t>
+      </w:r>
+      <w:r>
+        <w:rPr>
+          <w:color w:val="303030"/>
+          <w:sz w:val="21"/>
+          <w:szCs w:val="21"/>
+          <w:rtl w:val="1"/>
+        </w:rPr>
+        <w:t xml:space="preserve"> </w:t>
+      </w:r>
+      <w:r>
+        <w:rPr>
+          <w:color w:val="303030"/>
+          <w:sz w:val="21"/>
+          <w:szCs w:val="21"/>
+          <w:rtl w:val="1"/>
+        </w:rPr>
+        <w:t xml:space="preserve">לדורות</w:t>
+      </w:r>
+      <w:r>
+        <w:rPr>
+          <w:color w:val="303030"/>
+          <w:sz w:val="21"/>
+          <w:szCs w:val="21"/>
+          <w:rtl w:val="1"/>
+        </w:rPr>
+        <w:t xml:space="preserve"> </w:t>
+      </w:r>
+      <w:r>
+        <w:rPr>
+          <w:color w:val="303030"/>
+          <w:sz w:val="21"/>
+          <w:szCs w:val="21"/>
+          <w:rtl w:val="1"/>
+        </w:rPr>
+        <w:t xml:space="preserve">בקרב</w:t>
+      </w:r>
+      <w:r>
+        <w:rPr>
+          <w:color w:val="303030"/>
+          <w:sz w:val="21"/>
+          <w:szCs w:val="21"/>
+          <w:rtl w:val="1"/>
+        </w:rPr>
+        <w:t xml:space="preserve"> </w:t>
+      </w:r>
+      <w:r>
+        <w:rPr>
+          <w:color w:val="303030"/>
+          <w:sz w:val="21"/>
+          <w:szCs w:val="21"/>
+          <w:rtl w:val="1"/>
+        </w:rPr>
+        <w:t xml:space="preserve">לומדי</w:t>
+      </w:r>
+      <w:r>
+        <w:rPr>
+          <w:color w:val="303030"/>
+          <w:sz w:val="21"/>
+          <w:szCs w:val="21"/>
+          <w:rtl w:val="1"/>
+        </w:rPr>
+        <w:t xml:space="preserve"> </w:t>
+      </w:r>
+      <w:r>
+        <w:rPr>
+          <w:color w:val="303030"/>
+          <w:sz w:val="21"/>
+          <w:szCs w:val="21"/>
+          <w:rtl w:val="1"/>
+        </w:rPr>
+        <w:t xml:space="preserve">התורה</w:t>
+      </w:r>
+      <w:r>
+        <w:rPr>
+          <w:color w:val="303030"/>
+          <w:sz w:val="21"/>
+          <w:szCs w:val="21"/>
+          <w:rtl w:val="1"/>
+        </w:rPr>
+        <w:t xml:space="preserve"> </w:t>
+      </w:r>
+      <w:r>
+        <w:rPr>
+          <w:color w:val="303030"/>
+          <w:sz w:val="21"/>
+          <w:szCs w:val="21"/>
+          <w:rtl w:val="1"/>
+        </w:rPr>
+        <w:t xml:space="preserve">ופוסקי</w:t>
+      </w:r>
+      <w:r>
+        <w:rPr>
+          <w:color w:val="303030"/>
+          <w:sz w:val="21"/>
+          <w:szCs w:val="21"/>
+          <w:rtl w:val="1"/>
+        </w:rPr>
+        <w:t xml:space="preserve"> </w:t>
+      </w:r>
+      <w:r>
+        <w:rPr>
+          <w:color w:val="303030"/>
+          <w:sz w:val="21"/>
+          <w:szCs w:val="21"/>
+          <w:rtl w:val="1"/>
+        </w:rPr>
+        <w:t xml:space="preserve">ההלכה</w:t>
+      </w:r>
+      <w:r>
+        <w:rPr>
+          <w:color w:val="303030"/>
+          <w:sz w:val="21"/>
+          <w:szCs w:val="21"/>
+          <w:rtl w:val="1"/>
+        </w:rPr>
+        <w:t xml:space="preserve">.</w:t>
       </w:r>
     </w:p>
     <w:p>
@@ -10443,7 +12198,7 @@
       <w:pPr>
         <w:numPr>
           <w:ilvl w:val="0"/>
-          <w:numId w:val="2"/>
+          <w:numId w:val="3"/>
         </w:numPr>
         <w:bidi w:val="1"/>
         <w:spacing w:after="0" w:afterAutospacing="0" w:lineRule="auto"/>
@@ -11180,7 +12935,7 @@
       <w:pPr>
         <w:numPr>
           <w:ilvl w:val="0"/>
-          <w:numId w:val="2"/>
+          <w:numId w:val="3"/>
         </w:numPr>
         <w:bidi w:val="1"/>
         <w:spacing w:after="180" w:lineRule="auto"/>
@@ -25479,7 +27234,7 @@
       <w:pPr>
         <w:numPr>
           <w:ilvl w:val="0"/>
-          <w:numId w:val="3"/>
+          <w:numId w:val="4"/>
         </w:numPr>
         <w:bidi w:val="1"/>
         <w:spacing w:after="0" w:afterAutospacing="0" w:lineRule="auto"/>
@@ -26388,7 +28143,7 @@
       <w:pPr>
         <w:numPr>
           <w:ilvl w:val="0"/>
-          <w:numId w:val="3"/>
+          <w:numId w:val="4"/>
         </w:numPr>
         <w:bidi w:val="1"/>
         <w:spacing w:after="180" w:lineRule="auto"/>
@@ -34628,7 +36383,7 @@
       <w:pPr>
         <w:numPr>
           <w:ilvl w:val="0"/>
-          <w:numId w:val="4"/>
+          <w:numId w:val="2"/>
         </w:numPr>
         <w:bidi w:val="1"/>
         <w:spacing w:after="0" w:afterAutospacing="0" w:lineRule="auto"/>
@@ -34732,7 +36487,7 @@
       <w:pPr>
         <w:numPr>
           <w:ilvl w:val="0"/>
-          <w:numId w:val="4"/>
+          <w:numId w:val="2"/>
         </w:numPr>
         <w:bidi w:val="1"/>
         <w:spacing w:after="0" w:afterAutospacing="0" w:lineRule="auto"/>
@@ -34854,7 +36609,7 @@
       <w:pPr>
         <w:numPr>
           <w:ilvl w:val="0"/>
-          <w:numId w:val="4"/>
+          <w:numId w:val="2"/>
         </w:numPr>
         <w:bidi w:val="1"/>
         <w:spacing w:after="0" w:afterAutospacing="0" w:lineRule="auto"/>
@@ -34958,7 +36713,7 @@
       <w:pPr>
         <w:numPr>
           <w:ilvl w:val="0"/>
-          <w:numId w:val="4"/>
+          <w:numId w:val="2"/>
         </w:numPr>
         <w:bidi w:val="1"/>
         <w:spacing w:after="0" w:afterAutospacing="0" w:lineRule="auto"/>
@@ -35044,7 +36799,7 @@
       <w:pPr>
         <w:numPr>
           <w:ilvl w:val="0"/>
-          <w:numId w:val="4"/>
+          <w:numId w:val="2"/>
         </w:numPr>
         <w:bidi w:val="1"/>
         <w:spacing w:after="0" w:afterAutospacing="0" w:lineRule="auto"/>
@@ -35130,7 +36885,7 @@
       <w:pPr>
         <w:numPr>
           <w:ilvl w:val="0"/>
-          <w:numId w:val="4"/>
+          <w:numId w:val="2"/>
         </w:numPr>
         <w:bidi w:val="1"/>
         <w:spacing w:after="0" w:afterAutospacing="0" w:lineRule="auto"/>
@@ -35216,7 +36971,7 @@
       <w:pPr>
         <w:numPr>
           <w:ilvl w:val="0"/>
-          <w:numId w:val="4"/>
+          <w:numId w:val="2"/>
         </w:numPr>
         <w:bidi w:val="1"/>
         <w:spacing w:after="0" w:afterAutospacing="0" w:lineRule="auto"/>
@@ -35392,7 +37147,7 @@
       <w:pPr>
         <w:numPr>
           <w:ilvl w:val="0"/>
-          <w:numId w:val="4"/>
+          <w:numId w:val="2"/>
         </w:numPr>
         <w:bidi w:val="1"/>
         <w:spacing w:after="0" w:afterAutospacing="0" w:lineRule="auto"/>
@@ -35568,7 +37323,7 @@
       <w:pPr>
         <w:numPr>
           <w:ilvl w:val="0"/>
-          <w:numId w:val="4"/>
+          <w:numId w:val="2"/>
         </w:numPr>
         <w:bidi w:val="1"/>
         <w:spacing w:after="0" w:afterAutospacing="0" w:lineRule="auto"/>
@@ -35780,7 +37535,7 @@
       <w:pPr>
         <w:numPr>
           <w:ilvl w:val="0"/>
-          <w:numId w:val="4"/>
+          <w:numId w:val="2"/>
         </w:numPr>
         <w:bidi w:val="1"/>
         <w:spacing w:after="0" w:afterAutospacing="0" w:lineRule="auto"/>
@@ -35866,7 +37621,7 @@
       <w:pPr>
         <w:numPr>
           <w:ilvl w:val="0"/>
-          <w:numId w:val="4"/>
+          <w:numId w:val="2"/>
         </w:numPr>
         <w:bidi w:val="1"/>
         <w:spacing w:after="0" w:afterAutospacing="0" w:lineRule="auto"/>
@@ -36042,7 +37797,7 @@
       <w:pPr>
         <w:numPr>
           <w:ilvl w:val="0"/>
-          <w:numId w:val="4"/>
+          <w:numId w:val="2"/>
         </w:numPr>
         <w:bidi w:val="1"/>
         <w:spacing w:after="180" w:lineRule="auto"/>
@@ -36385,6 +38140,124 @@
   <w:abstractNum w:abstractNumId="3">
     <w:lvl w:ilvl="0">
       <w:start w:val="1"/>
+      <w:numFmt w:val="decimal"/>
+      <w:lvlText w:val="%1."/>
+      <w:lvlJc w:val="left"/>
+      <w:pPr>
+        <w:ind w:left="720" w:hanging="360"/>
+      </w:pPr>
+      <w:rPr>
+        <w:b w:val="0"/>
+        <w:bCs w:val="0"/>
+        <w:i w:val="0"/>
+        <w:iCs w:val="0"/>
+        <w:smallCaps w:val="0"/>
+        <w:color w:val="1b1b1c"/>
+        <w:sz w:val="21"/>
+        <w:szCs w:val="21"/>
+        <w:u w:val="none"/>
+      </w:rPr>
+    </w:lvl>
+    <w:lvl w:ilvl="1">
+      <w:start w:val="1"/>
+      <w:numFmt w:val="lowerLetter"/>
+      <w:lvlText w:val="%2."/>
+      <w:lvlJc w:val="left"/>
+      <w:pPr>
+        <w:ind w:left="1440" w:hanging="360"/>
+      </w:pPr>
+      <w:rPr>
+        <w:u w:val="none"/>
+      </w:rPr>
+    </w:lvl>
+    <w:lvl w:ilvl="2">
+      <w:start w:val="1"/>
+      <w:numFmt w:val="lowerRoman"/>
+      <w:lvlText w:val="%3."/>
+      <w:lvlJc w:val="left"/>
+      <w:pPr>
+        <w:ind w:left="2160" w:hanging="360"/>
+      </w:pPr>
+      <w:rPr>
+        <w:u w:val="none"/>
+      </w:rPr>
+    </w:lvl>
+    <w:lvl w:ilvl="3">
+      <w:start w:val="1"/>
+      <w:numFmt w:val="decimal"/>
+      <w:lvlText w:val="%4."/>
+      <w:lvlJc w:val="left"/>
+      <w:pPr>
+        <w:ind w:left="2880" w:hanging="360"/>
+      </w:pPr>
+      <w:rPr>
+        <w:u w:val="none"/>
+      </w:rPr>
+    </w:lvl>
+    <w:lvl w:ilvl="4">
+      <w:start w:val="1"/>
+      <w:numFmt w:val="lowerLetter"/>
+      <w:lvlText w:val="%5."/>
+      <w:lvlJc w:val="left"/>
+      <w:pPr>
+        <w:ind w:left="3600" w:hanging="360"/>
+      </w:pPr>
+      <w:rPr>
+        <w:u w:val="none"/>
+      </w:rPr>
+    </w:lvl>
+    <w:lvl w:ilvl="5">
+      <w:start w:val="1"/>
+      <w:numFmt w:val="lowerRoman"/>
+      <w:lvlText w:val="%6."/>
+      <w:lvlJc w:val="left"/>
+      <w:pPr>
+        <w:ind w:left="4320" w:hanging="360"/>
+      </w:pPr>
+      <w:rPr>
+        <w:u w:val="none"/>
+      </w:rPr>
+    </w:lvl>
+    <w:lvl w:ilvl="6">
+      <w:start w:val="1"/>
+      <w:numFmt w:val="decimal"/>
+      <w:lvlText w:val="%7."/>
+      <w:lvlJc w:val="left"/>
+      <w:pPr>
+        <w:ind w:left="5040" w:hanging="360"/>
+      </w:pPr>
+      <w:rPr>
+        <w:u w:val="none"/>
+      </w:rPr>
+    </w:lvl>
+    <w:lvl w:ilvl="7">
+      <w:start w:val="1"/>
+      <w:numFmt w:val="lowerLetter"/>
+      <w:lvlText w:val="%8."/>
+      <w:lvlJc w:val="left"/>
+      <w:pPr>
+        <w:ind w:left="5760" w:hanging="360"/>
+      </w:pPr>
+      <w:rPr>
+        <w:u w:val="none"/>
+      </w:rPr>
+    </w:lvl>
+    <w:lvl w:ilvl="8">
+      <w:start w:val="1"/>
+      <w:numFmt w:val="lowerRoman"/>
+      <w:lvlText w:val="%9."/>
+      <w:lvlJc w:val="left"/>
+      <w:pPr>
+        <w:ind w:left="6480" w:hanging="360"/>
+      </w:pPr>
+      <w:rPr>
+        <w:u w:val="none"/>
+      </w:rPr>
+    </w:lvl>
+  </w:abstractNum>
+  <w:abstractNum w:abstractNumId="4">
+    <w:lvl w:ilvl="0">
+      <w:start w:val="1"/>
       <w:numFmt w:val="bullet"/>
       <w:lvlText w:val="●"/>
       <w:lvlJc w:val="left"/>
@@ -36491,124 +38364,6 @@
       <w:start w:val="1"/>
       <w:numFmt w:val="bullet"/>
       <w:lvlText w:val="■"/>
-      <w:lvlJc w:val="left"/>
-      <w:pPr>
-        <w:ind w:left="6480" w:hanging="360"/>
-      </w:pPr>
-      <w:rPr>
-        <w:u w:val="none"/>
-      </w:rPr>
-    </w:lvl>
-  </w:abstractNum>
-  <w:abstractNum w:abstractNumId="4">
-    <w:lvl w:ilvl="0">
-      <w:start w:val="1"/>
-      <w:numFmt w:val="decimal"/>
-      <w:lvlText w:val="%1."/>
-      <w:lvlJc w:val="left"/>
-      <w:pPr>
-        <w:ind w:left="720" w:hanging="360"/>
-      </w:pPr>
-      <w:rPr>
-        <w:b w:val="0"/>
-        <w:bCs w:val="0"/>
-        <w:i w:val="0"/>
-        <w:iCs w:val="0"/>
-        <w:smallCaps w:val="0"/>
-        <w:color w:val="1b1b1c"/>
-        <w:sz w:val="21"/>
-        <w:szCs w:val="21"/>
-        <w:u w:val="none"/>
-      </w:rPr>
-    </w:lvl>
-    <w:lvl w:ilvl="1">
-      <w:start w:val="1"/>
-      <w:numFmt w:val="lowerLetter"/>
-      <w:lvlText w:val="%2."/>
-      <w:lvlJc w:val="left"/>
-      <w:pPr>
-        <w:ind w:left="1440" w:hanging="360"/>
-      </w:pPr>
-      <w:rPr>
-        <w:u w:val="none"/>
-      </w:rPr>
-    </w:lvl>
-    <w:lvl w:ilvl="2">
-      <w:start w:val="1"/>
-      <w:numFmt w:val="lowerRoman"/>
-      <w:lvlText w:val="%3."/>
-      <w:lvlJc w:val="left"/>
-      <w:pPr>
-        <w:ind w:left="2160" w:hanging="360"/>
-      </w:pPr>
-      <w:rPr>
-        <w:u w:val="none"/>
-      </w:rPr>
-    </w:lvl>
-    <w:lvl w:ilvl="3">
-      <w:start w:val="1"/>
-      <w:numFmt w:val="decimal"/>
-      <w:lvlText w:val="%4."/>
-      <w:lvlJc w:val="left"/>
-      <w:pPr>
-        <w:ind w:left="2880" w:hanging="360"/>
-      </w:pPr>
-      <w:rPr>
-        <w:u w:val="none"/>
-      </w:rPr>
-    </w:lvl>
-    <w:lvl w:ilvl="4">
-      <w:start w:val="1"/>
-      <w:numFmt w:val="lowerLetter"/>
-      <w:lvlText w:val="%5."/>
-      <w:lvlJc w:val="left"/>
-      <w:pPr>
-        <w:ind w:left="3600" w:hanging="360"/>
-      </w:pPr>
-      <w:rPr>
-        <w:u w:val="none"/>
-      </w:rPr>
-    </w:lvl>
-    <w:lvl w:ilvl="5">
-      <w:start w:val="1"/>
-      <w:numFmt w:val="lowerRoman"/>
-      <w:lvlText w:val="%6."/>
-      <w:lvlJc w:val="left"/>
-      <w:pPr>
-        <w:ind w:left="4320" w:hanging="360"/>
-      </w:pPr>
-      <w:rPr>
-        <w:u w:val="none"/>
-      </w:rPr>
-    </w:lvl>
-    <w:lvl w:ilvl="6">
-      <w:start w:val="1"/>
-      <w:numFmt w:val="decimal"/>
-      <w:lvlText w:val="%7."/>
-      <w:lvlJc w:val="left"/>
-      <w:pPr>
-        <w:ind w:left="5040" w:hanging="360"/>
-      </w:pPr>
-      <w:rPr>
-        <w:u w:val="none"/>
-      </w:rPr>
-    </w:lvl>
-    <w:lvl w:ilvl="7">
-      <w:start w:val="1"/>
-      <w:numFmt w:val="lowerLetter"/>
-      <w:lvlText w:val="%8."/>
-      <w:lvlJc w:val="left"/>
-      <w:pPr>
-        <w:ind w:left="5760" w:hanging="360"/>
-      </w:pPr>
-      <w:rPr>
-        <w:u w:val="none"/>
-      </w:rPr>
-    </w:lvl>
-    <w:lvl w:ilvl="8">
-      <w:start w:val="1"/>
-      <w:numFmt w:val="lowerRoman"/>
-      <w:lvlText w:val="%9."/>
       <w:lvlJc w:val="left"/>
       <w:pPr>
         <w:ind w:left="6480" w:hanging="360"/>

</xml_diff>